<commit_message>
Import SkillTreeSystem, ExperienceSystem and StatsSystem.
</commit_message>
<xml_diff>
--- a/GDD v.2.docx
+++ b/GDD v.2.docx
@@ -1110,30 +1110,38 @@
           <w:szCs w:val="28"/>
         </w:rPr>
       </w:pPr>
+      <w:r>
+        <w:rPr>
+          <w:rFonts w:ascii="Times New Roman" w:hAnsi="Times New Roman" w:cs="Times New Roman"/>
+          <w:sz w:val="28"/>
+          <w:szCs w:val="28"/>
+        </w:rPr>
+        <w:t>Разработать систему хранения диалогов. Скорей всего диалоги будут хранится в скриптейбл обджектах.</w:t>
+      </w:r>
+    </w:p>
+    <w:p>
+      <w:pPr>
+        <w:pStyle w:val="a3"/>
+        <w:numPr>
+          <w:ilvl w:val="1"/>
+          <w:numId w:val="1"/>
+        </w:numPr>
+        <w:rPr>
+          <w:rFonts w:ascii="Times New Roman" w:hAnsi="Times New Roman" w:cs="Times New Roman"/>
+          <w:sz w:val="28"/>
+          <w:szCs w:val="28"/>
+        </w:rPr>
+      </w:pPr>
+      <w:r>
+        <w:rPr>
+          <w:rFonts w:ascii="Times New Roman" w:hAnsi="Times New Roman" w:cs="Times New Roman"/>
+          <w:sz w:val="28"/>
+          <w:szCs w:val="28"/>
+        </w:rPr>
+        <w:t xml:space="preserve">Система дерева навыков. </w:t>
+      </w:r>
       <w:bookmarkStart w:id="0" w:name="_GoBack"/>
-      <w:r>
-        <w:rPr>
-          <w:rFonts w:ascii="Times New Roman" w:hAnsi="Times New Roman" w:cs="Times New Roman"/>
-          <w:sz w:val="28"/>
-          <w:szCs w:val="28"/>
-        </w:rPr>
-        <w:t>Разработать систему хранения диалогов. Скорей всего диалоги будут хранится в скриптейбл обджектах.</w:t>
-      </w:r>
-    </w:p>
-    <w:bookmarkEnd w:id="0"/>
-    <w:p>
-      <w:pPr>
-        <w:pStyle w:val="a3"/>
-        <w:numPr>
-          <w:ilvl w:val="1"/>
-          <w:numId w:val="1"/>
-        </w:numPr>
-        <w:rPr>
-          <w:rFonts w:ascii="Times New Roman" w:hAnsi="Times New Roman" w:cs="Times New Roman"/>
-          <w:sz w:val="28"/>
-          <w:szCs w:val="28"/>
-        </w:rPr>
-      </w:pPr>
+      <w:bookmarkEnd w:id="0"/>
       <w:r>
         <w:rPr>
           <w:rFonts w:ascii="Times New Roman" w:hAnsi="Times New Roman" w:cs="Times New Roman"/>
@@ -1156,23 +1164,7 @@
           <w:sz w:val="28"/>
           <w:szCs w:val="28"/>
         </w:rPr>
-        <w:t xml:space="preserve"> базовых характеристики: сила, ловкость, интеллект и харизма. За повышение каждого уровня игрок сможет улучшить только одну базовую характеристику. Характеристика сила позволит игроку создавать, сильного танка, а ловкость позволит игроку более быстрее перемещаться по игровому миру, также можно сделать возможность уклонения, ну а интеллект я хочу сделать </w:t>
-      </w:r>
-      <w:r>
-        <w:rPr>
-          <w:rFonts w:ascii="Times New Roman" w:hAnsi="Times New Roman" w:cs="Times New Roman"/>
-          <w:sz w:val="28"/>
-          <w:szCs w:val="28"/>
-        </w:rPr>
-        <w:t>навыком,</w:t>
-      </w:r>
-      <w:r>
-        <w:rPr>
-          <w:rFonts w:ascii="Times New Roman" w:hAnsi="Times New Roman" w:cs="Times New Roman"/>
-          <w:sz w:val="28"/>
-          <w:szCs w:val="28"/>
-        </w:rPr>
-        <w:t xml:space="preserve"> который поможет лучше выживать игроку в критических ситуациях. </w:t>
+        <w:t xml:space="preserve"> базовых характеристики: сила, ловкость, интеллект и харизма. За повышение каждого уровня игрок сможет улучшить только одну базовую характеристику. Характеристика сила позволит игроку создавать, сильного танка, а ловкость позволит игроку более быстрее перемещаться по игровому миру, также можно сделать возможность уклонения, ну а интеллект я хочу сделать навыком, который поможет лучше выживать игроку в критических ситуациях. </w:t>
       </w:r>
     </w:p>
     <w:p>
@@ -1216,71 +1208,7 @@
           <w:sz w:val="28"/>
           <w:szCs w:val="28"/>
         </w:rPr>
-        <w:t xml:space="preserve">Атрибуты непробиваемый и шестое чувство будут иметь </w:t>
-      </w:r>
-      <w:r>
-        <w:rPr>
-          <w:rFonts w:ascii="Times New Roman" w:hAnsi="Times New Roman" w:cs="Times New Roman"/>
-          <w:sz w:val="28"/>
-          <w:szCs w:val="28"/>
-        </w:rPr>
-        <w:t>процент,</w:t>
-      </w:r>
-      <w:r>
-        <w:rPr>
-          <w:rFonts w:ascii="Times New Roman" w:hAnsi="Times New Roman" w:cs="Times New Roman"/>
-          <w:sz w:val="28"/>
-          <w:szCs w:val="28"/>
-        </w:rPr>
-        <w:t xml:space="preserve"> который сигнализирует вероятность срабатывания навыка, для навыков знахарь, торговец и живучесть также будет присутствовать </w:t>
-      </w:r>
-      <w:r>
-        <w:rPr>
-          <w:rFonts w:ascii="Times New Roman" w:hAnsi="Times New Roman" w:cs="Times New Roman"/>
-          <w:sz w:val="28"/>
-          <w:szCs w:val="28"/>
-        </w:rPr>
-        <w:t>процент,</w:t>
-      </w:r>
-      <w:r>
-        <w:rPr>
-          <w:rFonts w:ascii="Times New Roman" w:hAnsi="Times New Roman" w:cs="Times New Roman"/>
-          <w:sz w:val="28"/>
-          <w:szCs w:val="28"/>
-        </w:rPr>
-        <w:t xml:space="preserve"> который будет повышать базовые </w:t>
-      </w:r>
-      <w:r>
-        <w:rPr>
-          <w:rFonts w:ascii="Times New Roman" w:hAnsi="Times New Roman" w:cs="Times New Roman"/>
-          <w:sz w:val="28"/>
-          <w:szCs w:val="28"/>
-        </w:rPr>
-        <w:t>значения, критическое</w:t>
-      </w:r>
-      <w:r>
-        <w:rPr>
-          <w:rFonts w:ascii="Times New Roman" w:hAnsi="Times New Roman" w:cs="Times New Roman"/>
-          <w:sz w:val="28"/>
-          <w:szCs w:val="28"/>
-        </w:rPr>
-        <w:t xml:space="preserve"> мышление также будет иметь </w:t>
-      </w:r>
-      <w:r>
-        <w:rPr>
-          <w:rFonts w:ascii="Times New Roman" w:hAnsi="Times New Roman" w:cs="Times New Roman"/>
-          <w:sz w:val="28"/>
-          <w:szCs w:val="28"/>
-        </w:rPr>
-        <w:t>процент,</w:t>
-      </w:r>
-      <w:r>
-        <w:rPr>
-          <w:rFonts w:ascii="Times New Roman" w:hAnsi="Times New Roman" w:cs="Times New Roman"/>
-          <w:sz w:val="28"/>
-          <w:szCs w:val="28"/>
-        </w:rPr>
-        <w:t xml:space="preserve"> который будет повышать вероятность срабатывания навыков. Этот процент для каждого из </w:t>
+        <w:t xml:space="preserve">Атрибуты непробиваемый и шестое чувство будут иметь процент, который сигнализирует вероятность срабатывания навыка, для навыков знахарь, торговец и живучесть также будет присутствовать процент, который будет повышать базовые значения, критическое мышление также будет иметь процент, который будет повышать вероятность срабатывания навыков. Этот процент для каждого из </w:t>
       </w:r>
       <w:r>
         <w:rPr>
@@ -1311,47 +1239,7 @@
           <w:sz w:val="28"/>
           <w:szCs w:val="28"/>
         </w:rPr>
-        <w:t>Максимальное количество очков,</w:t>
-      </w:r>
-      <w:r>
-        <w:rPr>
-          <w:rFonts w:ascii="Times New Roman" w:hAnsi="Times New Roman" w:cs="Times New Roman"/>
-          <w:sz w:val="28"/>
-          <w:szCs w:val="28"/>
-        </w:rPr>
-        <w:t xml:space="preserve"> которое можно вложить в атрибут будет ровно 10. Для того чтобы сдержать внезапное развитие персонажа будет введено </w:t>
-      </w:r>
-      <w:r>
-        <w:rPr>
-          <w:rFonts w:ascii="Times New Roman" w:hAnsi="Times New Roman" w:cs="Times New Roman"/>
-          <w:sz w:val="28"/>
-          <w:szCs w:val="28"/>
-        </w:rPr>
-        <w:t>ограничение,</w:t>
-      </w:r>
-      <w:r>
-        <w:rPr>
-          <w:rFonts w:ascii="Times New Roman" w:hAnsi="Times New Roman" w:cs="Times New Roman"/>
-          <w:sz w:val="28"/>
-          <w:szCs w:val="28"/>
-        </w:rPr>
-        <w:t xml:space="preserve"> которое позволит игроку повышать конкретный атрибут только после того как базовая характеристика к которой относится атрибут будет улучшена на 2. Таким образом для того чтобы достичь 10 уровня в атрибуте знахарь игроку нужно повысить базовый атрибут интеллект до 20. Исходя из вышеописанного </w:t>
-      </w:r>
-      <w:r>
-        <w:rPr>
-          <w:rFonts w:ascii="Times New Roman" w:hAnsi="Times New Roman" w:cs="Times New Roman"/>
-          <w:sz w:val="28"/>
-          <w:szCs w:val="28"/>
-        </w:rPr>
-        <w:t>получается,</w:t>
-      </w:r>
-      <w:r>
-        <w:rPr>
-          <w:rFonts w:ascii="Times New Roman" w:hAnsi="Times New Roman" w:cs="Times New Roman"/>
-          <w:sz w:val="28"/>
-          <w:szCs w:val="28"/>
-        </w:rPr>
-        <w:t xml:space="preserve"> что максимально допустимый уровень для игрока будет равен 60.</w:t>
+        <w:t>Максимальное количество очков, которое можно вложить в атрибут будет ровно 10. Для того чтобы сдержать внезапное развитие персонажа будет введено ограничение, которое позволит игроку повышать конкретный атрибут только после того как базовая характеристика к которой относится атрибут будет улучшена на 2. Таким образом для того чтобы достичь 10 уровня в атрибуте знахарь игроку нужно повысить базовый атрибут интеллект до 20. Исходя из вышеописанного получается, что максимально допустимый уровень для игрока будет равен 60.</w:t>
       </w:r>
     </w:p>
     <w:p>

</xml_diff>

<commit_message>
Before import prototype TradingSystem.
</commit_message>
<xml_diff>
--- a/GDD v.2.docx
+++ b/GDD v.2.docx
@@ -94,13 +94,15 @@
         </w:numPr>
         <w:rPr>
           <w:rFonts w:ascii="Times New Roman" w:hAnsi="Times New Roman" w:cs="Times New Roman"/>
-          <w:sz w:val="28"/>
-          <w:szCs w:val="28"/>
-        </w:rPr>
-      </w:pPr>
-      <w:r>
-        <w:rPr>
-          <w:rFonts w:ascii="Times New Roman" w:hAnsi="Times New Roman" w:cs="Times New Roman"/>
+          <w:strike/>
+          <w:sz w:val="28"/>
+          <w:szCs w:val="28"/>
+        </w:rPr>
+      </w:pPr>
+      <w:r>
+        <w:rPr>
+          <w:rFonts w:ascii="Times New Roman" w:hAnsi="Times New Roman" w:cs="Times New Roman"/>
+          <w:strike/>
           <w:sz w:val="28"/>
           <w:szCs w:val="28"/>
         </w:rPr>
@@ -899,7 +901,25 @@
           <w:sz w:val="28"/>
           <w:szCs w:val="28"/>
         </w:rPr>
-        <w:t>Система автоматического подбора лута.</w:t>
+        <w:t xml:space="preserve">Система автоматического подбора </w:t>
+      </w:r>
+      <w:proofErr w:type="spellStart"/>
+      <w:r>
+        <w:rPr>
+          <w:rFonts w:ascii="Times New Roman" w:hAnsi="Times New Roman" w:cs="Times New Roman"/>
+          <w:sz w:val="28"/>
+          <w:szCs w:val="28"/>
+        </w:rPr>
+        <w:t>лута</w:t>
+      </w:r>
+      <w:proofErr w:type="spellEnd"/>
+      <w:r>
+        <w:rPr>
+          <w:rFonts w:ascii="Times New Roman" w:hAnsi="Times New Roman" w:cs="Times New Roman"/>
+          <w:sz w:val="28"/>
+          <w:szCs w:val="28"/>
+        </w:rPr>
+        <w:t>.</w:t>
       </w:r>
       <w:r>
         <w:rPr>
@@ -1018,128 +1038,11 @@
         </w:numPr>
         <w:rPr>
           <w:rFonts w:ascii="Times New Roman" w:hAnsi="Times New Roman" w:cs="Times New Roman"/>
-          <w:sz w:val="28"/>
-          <w:szCs w:val="28"/>
-        </w:rPr>
-      </w:pPr>
-      <w:r>
-        <w:rPr>
-          <w:rFonts w:ascii="Times New Roman" w:hAnsi="Times New Roman" w:cs="Times New Roman"/>
-          <w:sz w:val="28"/>
-          <w:szCs w:val="28"/>
-        </w:rPr>
-        <w:t>Система диалогов. Разработать.</w:t>
-      </w:r>
-    </w:p>
-    <w:p>
-      <w:pPr>
-        <w:pStyle w:val="a3"/>
-        <w:numPr>
-          <w:ilvl w:val="1"/>
-          <w:numId w:val="1"/>
-        </w:numPr>
-        <w:rPr>
-          <w:rFonts w:ascii="Times New Roman" w:hAnsi="Times New Roman" w:cs="Times New Roman"/>
-          <w:sz w:val="28"/>
-          <w:szCs w:val="28"/>
-        </w:rPr>
-      </w:pPr>
-      <w:r>
-        <w:rPr>
-          <w:rFonts w:ascii="Times New Roman" w:hAnsi="Times New Roman" w:cs="Times New Roman"/>
-          <w:sz w:val="28"/>
-          <w:szCs w:val="28"/>
-        </w:rPr>
-        <w:t>Система торговли. Разработать.</w:t>
-      </w:r>
-    </w:p>
-    <w:p>
-      <w:pPr>
-        <w:pStyle w:val="a3"/>
-        <w:numPr>
-          <w:ilvl w:val="1"/>
-          <w:numId w:val="1"/>
-        </w:numPr>
-        <w:rPr>
-          <w:rFonts w:ascii="Times New Roman" w:hAnsi="Times New Roman" w:cs="Times New Roman"/>
-          <w:sz w:val="28"/>
-          <w:szCs w:val="28"/>
-        </w:rPr>
-      </w:pPr>
-      <w:r>
-        <w:rPr>
-          <w:rFonts w:ascii="Times New Roman" w:hAnsi="Times New Roman" w:cs="Times New Roman"/>
-          <w:sz w:val="28"/>
-          <w:szCs w:val="28"/>
-        </w:rPr>
-        <w:t>Система крестов. Разработать.</w:t>
-      </w:r>
-    </w:p>
-    <w:p>
-      <w:pPr>
-        <w:pStyle w:val="a3"/>
-        <w:numPr>
-          <w:ilvl w:val="1"/>
-          <w:numId w:val="1"/>
-        </w:numPr>
-        <w:rPr>
-          <w:rFonts w:ascii="Times New Roman" w:hAnsi="Times New Roman" w:cs="Times New Roman"/>
-          <w:sz w:val="28"/>
-          <w:szCs w:val="28"/>
-        </w:rPr>
-      </w:pPr>
-      <w:r>
-        <w:rPr>
-          <w:rFonts w:ascii="Times New Roman" w:hAnsi="Times New Roman" w:cs="Times New Roman"/>
-          <w:sz w:val="28"/>
-          <w:szCs w:val="28"/>
-        </w:rPr>
-        <w:t>Система перемещения для горожан. Разработать.</w:t>
-      </w:r>
-    </w:p>
-    <w:p>
-      <w:pPr>
-        <w:pStyle w:val="a3"/>
-        <w:numPr>
-          <w:ilvl w:val="1"/>
-          <w:numId w:val="1"/>
-        </w:numPr>
-        <w:rPr>
-          <w:rFonts w:ascii="Times New Roman" w:hAnsi="Times New Roman" w:cs="Times New Roman"/>
-          <w:sz w:val="28"/>
-          <w:szCs w:val="28"/>
-        </w:rPr>
-      </w:pPr>
-      <w:r>
-        <w:rPr>
-          <w:rFonts w:ascii="Times New Roman" w:hAnsi="Times New Roman" w:cs="Times New Roman"/>
-          <w:sz w:val="28"/>
-          <w:szCs w:val="28"/>
-        </w:rPr>
-        <w:t>Разработать систему хранения диалогов. Скорей всего диалоги будут хранится в скриптейбл обджектах.</w:t>
-      </w:r>
-    </w:p>
-    <w:p>
-      <w:pPr>
-        <w:pStyle w:val="a3"/>
-        <w:numPr>
-          <w:ilvl w:val="1"/>
-          <w:numId w:val="1"/>
-        </w:numPr>
-        <w:rPr>
-          <w:rFonts w:ascii="Times New Roman" w:hAnsi="Times New Roman" w:cs="Times New Roman"/>
-          <w:sz w:val="28"/>
-          <w:szCs w:val="28"/>
-        </w:rPr>
-      </w:pPr>
-      <w:r>
-        <w:rPr>
-          <w:rFonts w:ascii="Times New Roman" w:hAnsi="Times New Roman" w:cs="Times New Roman"/>
-          <w:sz w:val="28"/>
-          <w:szCs w:val="28"/>
-        </w:rPr>
-        <w:t xml:space="preserve">Система дерева навыков. </w:t>
-      </w:r>
+          <w:strike/>
+          <w:sz w:val="28"/>
+          <w:szCs w:val="28"/>
+        </w:rPr>
+      </w:pPr>
       <w:bookmarkStart w:id="0" w:name="_GoBack"/>
       <w:bookmarkEnd w:id="0"/>
       <w:r>
@@ -1148,6 +1051,142 @@
           <w:sz w:val="28"/>
           <w:szCs w:val="28"/>
         </w:rPr>
+        <w:t xml:space="preserve">Система диалогов. </w:t>
+      </w:r>
+      <w:r>
+        <w:rPr>
+          <w:rFonts w:ascii="Times New Roman" w:hAnsi="Times New Roman" w:cs="Times New Roman"/>
+          <w:strike/>
+          <w:sz w:val="28"/>
+          <w:szCs w:val="28"/>
+        </w:rPr>
+        <w:t>Разработать.</w:t>
+      </w:r>
+    </w:p>
+    <w:p>
+      <w:pPr>
+        <w:pStyle w:val="a3"/>
+        <w:numPr>
+          <w:ilvl w:val="1"/>
+          <w:numId w:val="1"/>
+        </w:numPr>
+        <w:rPr>
+          <w:rFonts w:ascii="Times New Roman" w:hAnsi="Times New Roman" w:cs="Times New Roman"/>
+          <w:sz w:val="28"/>
+          <w:szCs w:val="28"/>
+        </w:rPr>
+      </w:pPr>
+      <w:r>
+        <w:rPr>
+          <w:rFonts w:ascii="Times New Roman" w:hAnsi="Times New Roman" w:cs="Times New Roman"/>
+          <w:sz w:val="28"/>
+          <w:szCs w:val="28"/>
+        </w:rPr>
+        <w:t>Система торговли. Разработать.</w:t>
+      </w:r>
+    </w:p>
+    <w:p>
+      <w:pPr>
+        <w:pStyle w:val="a3"/>
+        <w:numPr>
+          <w:ilvl w:val="1"/>
+          <w:numId w:val="1"/>
+        </w:numPr>
+        <w:rPr>
+          <w:rFonts w:ascii="Times New Roman" w:hAnsi="Times New Roman" w:cs="Times New Roman"/>
+          <w:sz w:val="28"/>
+          <w:szCs w:val="28"/>
+        </w:rPr>
+      </w:pPr>
+      <w:r>
+        <w:rPr>
+          <w:rFonts w:ascii="Times New Roman" w:hAnsi="Times New Roman" w:cs="Times New Roman"/>
+          <w:sz w:val="28"/>
+          <w:szCs w:val="28"/>
+        </w:rPr>
+        <w:t xml:space="preserve">Система крестов. </w:t>
+      </w:r>
+      <w:r>
+        <w:rPr>
+          <w:rFonts w:ascii="Times New Roman" w:hAnsi="Times New Roman" w:cs="Times New Roman"/>
+          <w:strike/>
+          <w:sz w:val="28"/>
+          <w:szCs w:val="28"/>
+        </w:rPr>
+        <w:t>Разработать.</w:t>
+      </w:r>
+    </w:p>
+    <w:p>
+      <w:pPr>
+        <w:pStyle w:val="a3"/>
+        <w:numPr>
+          <w:ilvl w:val="1"/>
+          <w:numId w:val="1"/>
+        </w:numPr>
+        <w:rPr>
+          <w:rFonts w:ascii="Times New Roman" w:hAnsi="Times New Roman" w:cs="Times New Roman"/>
+          <w:sz w:val="28"/>
+          <w:szCs w:val="28"/>
+        </w:rPr>
+      </w:pPr>
+      <w:r>
+        <w:rPr>
+          <w:rFonts w:ascii="Times New Roman" w:hAnsi="Times New Roman" w:cs="Times New Roman"/>
+          <w:sz w:val="28"/>
+          <w:szCs w:val="28"/>
+        </w:rPr>
+        <w:t>Система перемещения для горожан. Разработать.</w:t>
+      </w:r>
+    </w:p>
+    <w:p>
+      <w:pPr>
+        <w:pStyle w:val="a3"/>
+        <w:numPr>
+          <w:ilvl w:val="1"/>
+          <w:numId w:val="1"/>
+        </w:numPr>
+        <w:rPr>
+          <w:rFonts w:ascii="Times New Roman" w:hAnsi="Times New Roman" w:cs="Times New Roman"/>
+          <w:sz w:val="28"/>
+          <w:szCs w:val="28"/>
+        </w:rPr>
+      </w:pPr>
+      <w:r>
+        <w:rPr>
+          <w:rFonts w:ascii="Times New Roman" w:hAnsi="Times New Roman" w:cs="Times New Roman"/>
+          <w:sz w:val="28"/>
+          <w:szCs w:val="28"/>
+        </w:rPr>
+        <w:t>Разработать систему хранения диалогов. Скорей всего диалоги будут хранится в скриптейбл обджектах.</w:t>
+      </w:r>
+    </w:p>
+    <w:p>
+      <w:pPr>
+        <w:pStyle w:val="a3"/>
+        <w:numPr>
+          <w:ilvl w:val="1"/>
+          <w:numId w:val="1"/>
+        </w:numPr>
+        <w:rPr>
+          <w:rFonts w:ascii="Times New Roman" w:hAnsi="Times New Roman" w:cs="Times New Roman"/>
+          <w:sz w:val="28"/>
+          <w:szCs w:val="28"/>
+        </w:rPr>
+      </w:pPr>
+      <w:r>
+        <w:rPr>
+          <w:rFonts w:ascii="Times New Roman" w:hAnsi="Times New Roman" w:cs="Times New Roman"/>
+          <w:sz w:val="28"/>
+          <w:szCs w:val="28"/>
+        </w:rPr>
+        <w:t xml:space="preserve">Система дерева навыков. </w:t>
+      </w:r>
+      <w:r>
+        <w:rPr>
+          <w:rFonts w:ascii="Times New Roman" w:hAnsi="Times New Roman" w:cs="Times New Roman"/>
+          <w:sz w:val="28"/>
+          <w:szCs w:val="28"/>
+        </w:rPr>
         <w:t>Нач</w:t>
       </w:r>
       <w:r>
@@ -1273,13 +1312,15 @@
         </w:numPr>
         <w:rPr>
           <w:rFonts w:ascii="Times New Roman" w:hAnsi="Times New Roman" w:cs="Times New Roman"/>
-          <w:sz w:val="28"/>
-          <w:szCs w:val="28"/>
-        </w:rPr>
-      </w:pPr>
-      <w:r>
-        <w:rPr>
-          <w:rFonts w:ascii="Times New Roman" w:hAnsi="Times New Roman" w:cs="Times New Roman"/>
+          <w:strike/>
+          <w:sz w:val="28"/>
+          <w:szCs w:val="28"/>
+        </w:rPr>
+      </w:pPr>
+      <w:r>
+        <w:rPr>
+          <w:rFonts w:ascii="Times New Roman" w:hAnsi="Times New Roman" w:cs="Times New Roman"/>
+          <w:strike/>
           <w:sz w:val="28"/>
           <w:szCs w:val="28"/>
         </w:rPr>
@@ -1295,13 +1336,15 @@
         </w:numPr>
         <w:rPr>
           <w:rFonts w:ascii="Times New Roman" w:hAnsi="Times New Roman" w:cs="Times New Roman"/>
-          <w:sz w:val="28"/>
-          <w:szCs w:val="28"/>
-        </w:rPr>
-      </w:pPr>
-      <w:r>
-        <w:rPr>
-          <w:rFonts w:ascii="Times New Roman" w:hAnsi="Times New Roman" w:cs="Times New Roman"/>
+          <w:strike/>
+          <w:sz w:val="28"/>
+          <w:szCs w:val="28"/>
+        </w:rPr>
+      </w:pPr>
+      <w:r>
+        <w:rPr>
+          <w:rFonts w:ascii="Times New Roman" w:hAnsi="Times New Roman" w:cs="Times New Roman"/>
+          <w:strike/>
           <w:sz w:val="28"/>
           <w:szCs w:val="28"/>
         </w:rPr>
@@ -1467,13 +1510,15 @@
         </w:numPr>
         <w:rPr>
           <w:rFonts w:ascii="Times New Roman" w:hAnsi="Times New Roman" w:cs="Times New Roman"/>
-          <w:sz w:val="28"/>
-          <w:szCs w:val="28"/>
-        </w:rPr>
-      </w:pPr>
-      <w:r>
-        <w:rPr>
-          <w:rFonts w:ascii="Times New Roman" w:hAnsi="Times New Roman" w:cs="Times New Roman"/>
+          <w:strike/>
+          <w:sz w:val="28"/>
+          <w:szCs w:val="28"/>
+        </w:rPr>
+      </w:pPr>
+      <w:r>
+        <w:rPr>
+          <w:rFonts w:ascii="Times New Roman" w:hAnsi="Times New Roman" w:cs="Times New Roman"/>
+          <w:strike/>
           <w:sz w:val="28"/>
           <w:szCs w:val="28"/>
         </w:rPr>
@@ -1496,6 +1541,7 @@
       <w:r>
         <w:rPr>
           <w:rFonts w:ascii="Times New Roman" w:hAnsi="Times New Roman" w:cs="Times New Roman"/>
+          <w:strike/>
           <w:sz w:val="28"/>
           <w:szCs w:val="28"/>
         </w:rPr>
@@ -1685,7 +1731,7 @@
   <w:abstractNum w:abstractNumId="0" w15:restartNumberingAfterBreak="0">
     <w:nsid w:val="7A5C735A"/>
     <w:multiLevelType w:val="hybridMultilevel"/>
-    <w:tmpl w:val="0BCE1AC6"/>
+    <w:tmpl w:val="E25099DC"/>
     <w:lvl w:ilvl="0" w:tplc="0419000F">
       <w:start w:val="1"/>
       <w:numFmt w:val="decimal"/>
@@ -1695,7 +1741,7 @@
         <w:ind w:left="720" w:hanging="360"/>
       </w:pPr>
     </w:lvl>
-    <w:lvl w:ilvl="1" w:tplc="04190019">
+    <w:lvl w:ilvl="1" w:tplc="16563F0E">
       <w:start w:val="1"/>
       <w:numFmt w:val="lowerLetter"/>
       <w:lvlText w:val="%2."/>
@@ -1703,6 +1749,9 @@
       <w:pPr>
         <w:ind w:left="1440" w:hanging="360"/>
       </w:pPr>
+      <w:rPr>
+        <w:strike w:val="0"/>
+      </w:rPr>
     </w:lvl>
     <w:lvl w:ilvl="2" w:tplc="0419001B">
       <w:start w:val="1"/>

</xml_diff>

<commit_message>
Add FloorSpikes. Start update chunk for generate level.
</commit_message>
<xml_diff>
--- a/GDD v.2.docx
+++ b/GDD v.2.docx
@@ -52,7 +52,17 @@
           <w:sz w:val="28"/>
           <w:szCs w:val="28"/>
         </w:rPr>
-        <w:t>Задача: задача в первой версии игры состояла в максимально простеньком геймплее, но в тоже время чтобы этот простенький геймплей не выглядел уж слишком плохо. Текущий этап разработки можно назвать вторым этапом хоть изначально такого в планах и не было. Но исходя из того, что появилась возможность расширить игру я займусь ее расширением. В основном это все затевается для того чтобы достичь целей проекта, и в тоже время повысить мой скилл в разработке игр.</w:t>
+        <w:t xml:space="preserve">Задача: задача в первой версии игры состояла в максимально простеньком геймплее, но в тоже время чтобы этот простенький геймплей не выглядел уж слишком плохо. Текущий этап разработки можно назвать вторым этапом хоть изначально такого в планах и не было. Но исходя из того, что появилась возможность расширить игру я займусь ее расширением. </w:t>
+      </w:r>
+      <w:bookmarkStart w:id="0" w:name="_GoBack"/>
+      <w:bookmarkEnd w:id="0"/>
+      <w:r>
+        <w:rPr>
+          <w:rFonts w:ascii="Times New Roman" w:hAnsi="Times New Roman" w:cs="Times New Roman"/>
+          <w:sz w:val="28"/>
+          <w:szCs w:val="28"/>
+        </w:rPr>
+        <w:t>В основном это все затевается для того чтобы достичь целей проекта, и в тоже время повысить мой скилл в разработке игр.</w:t>
       </w:r>
       <w:r>
         <w:rPr>
@@ -118,13 +128,15 @@
         </w:numPr>
         <w:rPr>
           <w:rFonts w:ascii="Times New Roman" w:hAnsi="Times New Roman" w:cs="Times New Roman"/>
-          <w:sz w:val="28"/>
-          <w:szCs w:val="28"/>
-        </w:rPr>
-      </w:pPr>
-      <w:r>
-        <w:rPr>
-          <w:rFonts w:ascii="Times New Roman" w:hAnsi="Times New Roman" w:cs="Times New Roman"/>
+          <w:strike/>
+          <w:sz w:val="28"/>
+          <w:szCs w:val="28"/>
+        </w:rPr>
+      </w:pPr>
+      <w:r>
+        <w:rPr>
+          <w:rFonts w:ascii="Times New Roman" w:hAnsi="Times New Roman" w:cs="Times New Roman"/>
+          <w:strike/>
           <w:sz w:val="28"/>
           <w:szCs w:val="28"/>
         </w:rPr>
@@ -186,13 +198,15 @@
         </w:numPr>
         <w:rPr>
           <w:rFonts w:ascii="Times New Roman" w:hAnsi="Times New Roman" w:cs="Times New Roman"/>
-          <w:sz w:val="28"/>
-          <w:szCs w:val="28"/>
-        </w:rPr>
-      </w:pPr>
-      <w:r>
-        <w:rPr>
-          <w:rFonts w:ascii="Times New Roman" w:hAnsi="Times New Roman" w:cs="Times New Roman"/>
+          <w:strike/>
+          <w:sz w:val="28"/>
+          <w:szCs w:val="28"/>
+        </w:rPr>
+      </w:pPr>
+      <w:r>
+        <w:rPr>
+          <w:rFonts w:ascii="Times New Roman" w:hAnsi="Times New Roman" w:cs="Times New Roman"/>
+          <w:strike/>
           <w:sz w:val="28"/>
           <w:szCs w:val="28"/>
         </w:rPr>
@@ -208,13 +222,15 @@
         </w:numPr>
         <w:rPr>
           <w:rFonts w:ascii="Times New Roman" w:hAnsi="Times New Roman" w:cs="Times New Roman"/>
-          <w:sz w:val="28"/>
-          <w:szCs w:val="28"/>
-        </w:rPr>
-      </w:pPr>
-      <w:r>
-        <w:rPr>
-          <w:rFonts w:ascii="Times New Roman" w:hAnsi="Times New Roman" w:cs="Times New Roman"/>
+          <w:strike/>
+          <w:sz w:val="28"/>
+          <w:szCs w:val="28"/>
+        </w:rPr>
+      </w:pPr>
+      <w:r>
+        <w:rPr>
+          <w:rFonts w:ascii="Times New Roman" w:hAnsi="Times New Roman" w:cs="Times New Roman"/>
+          <w:strike/>
           <w:sz w:val="28"/>
           <w:szCs w:val="28"/>
         </w:rPr>
@@ -1043,8 +1059,6 @@
           <w:szCs w:val="28"/>
         </w:rPr>
       </w:pPr>
-      <w:bookmarkStart w:id="0" w:name="_GoBack"/>
-      <w:bookmarkEnd w:id="0"/>
       <w:r>
         <w:rPr>
           <w:rFonts w:ascii="Times New Roman" w:hAnsi="Times New Roman" w:cs="Times New Roman"/>

</xml_diff>